<commit_message>
Update figures and tables
</commit_message>
<xml_diff>
--- a/Tables/Table_1.2.docx
+++ b/Tables/Table_1.2.docx
@@ -91,7 +91,7 @@
               <w:pStyle w:val="Normal"/>
             </w:pPr>
             <w:r>
-              <w:t>13 ± 108</w:t>
+              <w:t>13 ± 108 (2)</w:t>
             </w:r>
           </w:p>
         </w:tc>
@@ -101,7 +101,7 @@
               <w:pStyle w:val="Normal"/>
             </w:pPr>
             <w:r>
-              <w:t>24 ± 33</w:t>
+              <w:t>24 ± 33 (17)</w:t>
             </w:r>
           </w:p>
         </w:tc>
@@ -111,7 +111,7 @@
               <w:pStyle w:val="Normal"/>
             </w:pPr>
             <w:r>
-              <w:t>11 ± 112</w:t>
+              <w:t>11 ± 112 (12)</w:t>
             </w:r>
           </w:p>
         </w:tc>

</xml_diff>